<commit_message>
passando a bola pro rechu
</commit_message>
<xml_diff>
--- a/Relatorio_BagreAI_Demo.docx
+++ b/Relatorio_BagreAI_Demo.docx
@@ -52,7 +52,7 @@
           <w:color w:val="888888"/>
           <w:sz w:val="20"/>
         </w:rPr>
-        <w:t>Gerado em: 07/06/2026 23:43</w:t>
+        <w:t>Gerado em: 09/06/2026 17:32</w:t>
       </w:r>
     </w:p>
     <w:p>
@@ -2450,58 +2450,6 @@
     </w:p>
     <w:p/>
     <w:p>
-      <w:pPr>
-        <w:jc w:val="center"/>
-      </w:pPr>
-      <w:r>
-        <w:rPr>
-          <w:b/>
-          <w:sz w:val="22"/>
-        </w:rPr>
-        <w:t>Grafico 5: Concentracao de Riqueza - Curva de Lorenz</w:t>
-      </w:r>
-    </w:p>
-    <w:p>
-      <w:pPr>
-        <w:jc w:val="center"/>
-      </w:pPr>
-      <w:r>
-        <w:drawing>
-          <wp:inline xmlns:a="http://schemas.openxmlformats.org/drawingml/2006/main" xmlns:pic="http://schemas.openxmlformats.org/drawingml/2006/picture">
-            <wp:extent cx="5303520" cy="4640580"/>
-            <wp:docPr id="5" name="Picture 5"/>
-            <wp:cNvGraphicFramePr>
-              <a:graphicFrameLocks noChangeAspect="1"/>
-            </wp:cNvGraphicFramePr>
-            <a:graphic>
-              <a:graphicData uri="http://schemas.openxmlformats.org/drawingml/2006/picture">
-                <pic:pic>
-                  <pic:nvPicPr>
-                    <pic:cNvPr id="0" name="gini_liga.png"/>
-                    <pic:cNvPicPr/>
-                  </pic:nvPicPr>
-                  <pic:blipFill>
-                    <a:blip r:embed="rId14"/>
-                    <a:stretch>
-                      <a:fillRect/>
-                    </a:stretch>
-                  </pic:blipFill>
-                  <pic:spPr>
-                    <a:xfrm>
-                      <a:off x="0" y="0"/>
-                      <a:ext cx="5303520" cy="4640580"/>
-                    </a:xfrm>
-                    <a:prstGeom prst="rect"/>
-                  </pic:spPr>
-                </pic:pic>
-              </a:graphicData>
-            </a:graphic>
-          </wp:inline>
-        </w:drawing>
-      </w:r>
-    </w:p>
-    <w:p/>
-    <w:p>
       <w:r>
         <w:br w:type="page"/>
       </w:r>
@@ -2538,19 +2486,6 @@
     <w:p>
       <w:r>
         <w:t>Regressao linear simples com X = Performance (Gols + Assists) e Y = Valor de Mercado. O residuo de cada jogador mede o quanto seu preco se afasta do esperado pela reta. Residuo &gt; +1 desvio padrao: PediRato (caro para o que entrega). Residuo &lt; -1 desvio padrao: Pedigree (barato para o que entrega).</w:t>
-      </w:r>
-    </w:p>
-    <w:p>
-      <w:pPr>
-        <w:pStyle w:val="Heading2"/>
-      </w:pPr>
-      <w:r>
-        <w:t>Coeficiente de Gini — Concentracao por Liga (Frente 3)</w:t>
-      </w:r>
-    </w:p>
-    <w:p>
-      <w:r>
-        <w:t>Metrica de desigualdade economica adaptada ao futebol. Calculada manualmente sobre o valor total dos elencos de uma liga. Varia de 0 (igualdade perfeita) a 1 (concentracao maxima). A Curva de Lorenz visualiza a distribuicao acumulada de riqueza entre os clubes.</w:t>
       </w:r>
     </w:p>
     <w:p>

</xml_diff>